<commit_message>
⚙️ Auto-génération des classes
</commit_message>
<xml_diff>
--- a/csv_parser/out/RC-EDA/RC-EDA.schema.docx
+++ b/csv_parser/out/RC-EDA/RC-EDA.schema.docx
@@ -2862,7 +2862,7 @@
           </w:tcPr>
           <w:p>
             <w:r>
-              <w:t>C07.13.02</w:t>
+              <w:t>R01</w:t>
             </w:r>
           </w:p>
         </w:tc>
@@ -3076,7 +3076,7 @@
           </w:tcPr>
           <w:p>
             <w:r>
-              <w:t>C07.13.02</w:t>
+              <w:t>R01</w:t>
             </w:r>
           </w:p>
         </w:tc>
@@ -3290,7 +3290,7 @@
           </w:tcPr>
           <w:p>
             <w:r>
-              <w:t>C07.13.02</w:t>
+              <w:t>R01</w:t>
             </w:r>
           </w:p>
         </w:tc>
@@ -3504,7 +3504,7 @@
           </w:tcPr>
           <w:p>
             <w:r>
-              <w:t>C07.13.02</w:t>
+              <w:t>R01</w:t>
             </w:r>
           </w:p>
         </w:tc>

</xml_diff>